<commit_message>
Added extra wording to the body form, and centered the texted
</commit_message>
<xml_diff>
--- a/evidence/FISA Project.docx
+++ b/evidence/FISA Project.docx
@@ -769,6 +769,81 @@
             </a:graphic>
           </wp:inline>
         </w:drawing>
+      </w:r>
+    </w:p>
+    <w:p>
+      <w:pPr>
+        <w:pStyle w:val="Heading2"/>
+      </w:pPr>
+      <w:r>
+        <w:t>B8. Feature branch</w:t>
+      </w:r>
+    </w:p>
+    <w:p>
+      <w:r>
+        <w:t>Create and switch to a feature branch before making a new change to the project</w:t>
+      </w:r>
+    </w:p>
+    <w:p>
+      <w:pPr>
+        <w:rPr>
+          <w:b/>
+          <w:bCs/>
+        </w:rPr>
+      </w:pPr>
+      <w:r>
+        <w:rPr>
+          <w:noProof/>
+          <w14:ligatures w14:val="standardContextual"/>
+        </w:rPr>
+        <w:drawing>
+          <wp:inline distT="0" distB="0" distL="0" distR="0" wp14:anchorId="102DF1DB" wp14:editId="61C72CC5">
+            <wp:extent cx="5731510" cy="753110"/>
+            <wp:effectExtent l="0" t="0" r="2540" b="8890"/>
+            <wp:docPr id="710149418" name="Picture 1" descr="The image depicts a code snippet from a GitHub repository, specifically a command line interface output showing the process of switching to a new branch named 'colour-fix' in a Git repository.&#10;&#10;AI-generated content may be incorrect."/>
+            <wp:cNvGraphicFramePr>
+              <a:graphicFrameLocks xmlns:a="http://schemas.openxmlformats.org/drawingml/2006/main" noChangeAspect="1"/>
+            </wp:cNvGraphicFramePr>
+            <a:graphic xmlns:a="http://schemas.openxmlformats.org/drawingml/2006/main">
+              <a:graphicData uri="http://schemas.openxmlformats.org/drawingml/2006/picture">
+                <pic:pic xmlns:pic="http://schemas.openxmlformats.org/drawingml/2006/picture">
+                  <pic:nvPicPr>
+                    <pic:cNvPr id="710149418" name="Picture 1" descr="The image depicts a code snippet from a GitHub repository, specifically a command line interface output showing the process of switching to a new branch named 'colour-fix' in a Git repository.&#10;&#10;AI-generated content may be incorrect."/>
+                    <pic:cNvPicPr/>
+                  </pic:nvPicPr>
+                  <pic:blipFill>
+                    <a:blip r:embed="rId15"/>
+                    <a:stretch>
+                      <a:fillRect/>
+                    </a:stretch>
+                  </pic:blipFill>
+                  <pic:spPr>
+                    <a:xfrm>
+                      <a:off x="0" y="0"/>
+                      <a:ext cx="5731510" cy="753110"/>
+                    </a:xfrm>
+                    <a:prstGeom prst="rect">
+                      <a:avLst/>
+                    </a:prstGeom>
+                  </pic:spPr>
+                </pic:pic>
+              </a:graphicData>
+            </a:graphic>
+          </wp:inline>
+        </w:drawing>
+      </w:r>
+    </w:p>
+    <w:p>
+      <w:pPr>
+        <w:pStyle w:val="Heading2"/>
+      </w:pPr>
+      <w:r>
+        <w:t>B9. Stage and commit</w:t>
+      </w:r>
+    </w:p>
+    <w:p>
+      <w:r>
+        <w:t>Stage a suitable change and create a commit with a clear message describing what changed.</w:t>
       </w:r>
     </w:p>
     <w:p>

</xml_diff>